<commit_message>
update the signup and signin.
</commit_message>
<xml_diff>
--- a/Documents/Peer-to-peer learning platform documentation.docx
+++ b/Documents/Peer-to-peer learning platform documentation.docx
@@ -1561,7 +1561,7 @@
           <w:sz w:val="24"/>
           <w:szCs w:val="24"/>
         </w:rPr>
-        <w:t>Node.js / Express or Django</w:t>
+        <w:t>Django</w:t>
       </w:r>
     </w:p>
     <w:p>
@@ -1641,7 +1641,7 @@
           <w:sz w:val="24"/>
           <w:szCs w:val="24"/>
         </w:rPr>
-        <w:t>PostgreSQL / MongoDB</w:t>
+        <w:t>PostgreSQL</w:t>
       </w:r>
     </w:p>
     <w:p>
@@ -7130,6 +7130,7 @@
   <w:style w:type="character" w:default="1" w:styleId="DefaultParagraphFont">
     <w:name w:val="Default Paragraph Font"/>
     <w:uiPriority w:val="1"/>
+    <w:semiHidden/>
     <w:unhideWhenUsed/>
   </w:style>
   <w:style w:type="table" w:default="1" w:styleId="TableNormal">

</xml_diff>